<commit_message>
Regenerate the DOCX and PDF documentation
</commit_message>
<xml_diff>
--- a/docs/SmartPot_Documentacion_Tecnica.docx
+++ b/docs/SmartPot_Documentacion_Tecnica.docx
@@ -4416,7 +4416,7 @@
                 <w:sz w:val="17"/>
                 <w:szCs w:val="17"/>
               </w:rPr>
-              <w:t xml:space="preserve">MQTT con TLS 1.2 y WebSocket; una cuenta por maceta</w:t>
+              <w:t xml:space="preserve">MQTT con TLS 1.2+ y WebSocket; una cuenta por maceta</w:t>
             </w:r>
           </w:p>
         </w:tc>
@@ -7313,7 +7313,7 @@
                 <w:sz w:val="17"/>
                 <w:szCs w:val="17"/>
               </w:rPr>
-              <w:t xml:space="preserve">, MQTT sobre TLS 1.2</w:t>
+              <w:t xml:space="preserve">, MQTT sobre TLS 1.3 (mínimo 1.2)</w:t>
             </w:r>
           </w:p>
         </w:tc>
@@ -18742,7 +18742,7 @@
                 <w:sz w:val="17"/>
                 <w:szCs w:val="17"/>
               </w:rPr>
-              <w:t xml:space="preserve">HTTPS con HSTS; MQTT sobre TLS 1.2 con CA propia; WebSocket seguro</w:t>
+              <w:t xml:space="preserve">HTTPS con HSTS; MQTT sobre TLS 1.2+ con CA propia; WebSocket seguro</w:t>
             </w:r>
           </w:p>
         </w:tc>

</xml_diff>